<commit_message>
Remove the Auditor officer position and its minutes heading
Co-Authored-By: Claude Opus 5.5 <noreply@anthropic.com>
</commit_message>
<xml_diff>
--- a/lib/templates/meeting-minutes-template.docx
+++ b/lib/templates/meeting-minutes-template.docx
@@ -1016,39 +1016,6 @@
           <w:szCs w:val="20"/>
         </w:rPr>
       </w:pPr>
-    </w:p>
-    <w:p>
-      <w:pPr>
-        <w:numPr>
-          <w:ilvl w:val="1"/>
-          <w:numId w:val="101"/>
-        </w:numPr>
-        <w:tabs>
-          <w:tab w:val="left" w:pos="2310"/>
-        </w:tabs>
-        <w:spacing w:line="259" w:lineRule="auto"/>
-        <w:rPr>
-          <w:rFonts w:ascii="Garamond" w:eastAsia="Garamond" w:hAnsi="Garamond" w:cs="Garamond"/>
-          <w:sz w:val="20"/>
-          <w:szCs w:val="20"/>
-        </w:rPr>
-      </w:pPr>
-      <w:r>
-        <w:rPr>
-          <w:rFonts w:ascii="Garamond" w:eastAsia="Garamond" w:hAnsi="Garamond" w:cs="Garamond"/>
-          <w:sz w:val="20"/>
-          <w:szCs w:val="20"/>
-        </w:rPr>
-        <w:t xml:space="preserve">Auditor </w:t>
-      </w:r>
-      <w:r>
-        <w:rPr>
-          <w:rFonts w:ascii="Garamond" w:eastAsia="Garamond" w:hAnsi="Garamond" w:cs="Garamond"/>
-          <w:sz w:val="20"/>
-          <w:szCs w:val="20"/>
-        </w:rPr>
-        <w:t xml:space="preserve">()</w:t>
-      </w:r>
     </w:p>
     <w:p>
       <w:pPr>

</xml_diff>